<commit_message>
n8n CSM Guided West Coast: score 87; OAuth/API-key credentials confirmed, salary $120K
Co-Authored-By: Claude Opus 5.5 <noreply@anthropic.com>
Claude-Session: https://claude.ai/code/session_018DEej5NGjq1omj9BTtvEiy
</commit_message>
<xml_diff>
--- a/applications/n8n-csm-guided-west-coast/n8n-CSMGuidedWest-Resume.docx
+++ b/applications/n8n-csm-guided-west-coast/n8n-CSMGuidedWest-Resume.docx
@@ -177,7 +177,7 @@
           <w:i w:val="0"/>
           <w:color w:val="1A1A1A"/>
         </w:rPr>
-        <w:t>Build and run production automations in n8n, Make, and Zapier for client businesses, configuring inbound and outbound webhooks, REST API calls, and JSON payloads, and debugging integration errors myself.</w:t>
+        <w:t>Build and run production automations in n8n, Make, and Zapier for client businesses, configuring OAuth and API-key credentials, inbound and outbound webhooks, REST API calls, and JSON payloads, and debugging integration errors myself.</w:t>
       </w:r>
     </w:p>
     <w:p>
@@ -944,7 +944,7 @@
           <w:i w:val="0"/>
           <w:color w:val="1A1A1A"/>
         </w:rPr>
-        <w:t>n8n, Make, Zapier (hands-on builder), Webhooks, REST APIs, JSON, JavaScript &amp; Python (code steps), LLM APIs, HTML/CSS, SQL (working)</w:t>
+        <w:t>n8n, Make, Zapier (hands-on builder), OAuth &amp; API-Key Auth, Webhooks, REST APIs, JSON, JavaScript &amp; Python (code steps), LLM APIs, HTML/CSS, SQL (working)</w:t>
       </w:r>
     </w:p>
     <w:p>

</xml_diff>